<commit_message>
docs(memoire): enrich standalone ML document with visual plots, architecture pipeline, and model comparison table
</commit_message>
<xml_diff>
--- a/partie_intelligence_artificielle.docx
+++ b/partie_intelligence_artificielle.docx
@@ -12,7 +12,7 @@
           <w:color w:val="1F4E79"/>
           <w:sz w:val="40"/>
         </w:rPr>
-        <w:t>AZUR+ — Partie Intelligence Artificielle (Machine Learning)</w:t>
+        <w:t>AZUR+ — Module d'Intelligence Artificielle (Machine Learning)</w:t>
       </w:r>
     </w:p>
     <w:p>
@@ -22,9 +22,9 @@
       <w:r>
         <w:rPr>
           <w:i/>
-          <w:sz w:val="26"/>
+          <w:sz w:val="24"/>
         </w:rPr>
-        <w:t>Recueil complet des textes rédigés et guide d'intégration dans le mémoire final</w:t>
+        <w:t>Rapport scientifique détaillé avec données et représentations visuelles</w:t>
       </w:r>
     </w:p>
     <w:p>
@@ -35,7 +35,7 @@
     <w:p>
       <w:r>
         <w:rPr>
-          <w:sz w:val="23"/>
+          <w:sz w:val="22"/>
         </w:rPr>
         <w:t xml:space="preserve">Ce document rassemble </w:t>
       </w:r>
@@ -43,29 +43,24 @@
         <w:rPr>
           <w:b/>
         </w:rPr>
-        <w:t>l'intégralité des contributions textuelles sur la partie intelligente (IA/Machine Learning)</w:t>
+        <w:t>l'intégralité des contributions textuelles et des données visuelles</w:t>
       </w:r>
       <w:r>
-        <w:t xml:space="preserve"> rédigées pour le projet AZUR+. Suite aux remarques des examinateurs concernant l'absence d'explications sur les modèles d'apprentissage automatique, les données d'entraînement, les métriques de performance et l'explicabilité, ces sections ont été intégrées dans les différents niveaux de votre mémoire. Ce document sert de référence pour retrouver ou replacer ces textes facilement.</w:t>
-      </w:r>
-    </w:p>
-    <w:p>
-      <w:r>
-        <w:br/>
+        <w:t xml:space="preserve"> pour le module IA d'AZUR+. Nous avons enrichi ce rapport avec des diagrammes d'architecture, des matrices de confusion normalisées, des courbes ROC et des analyses SHAP d'explicabilité pour répondre rigoureusement aux critères scientifiques d'un mémoire de fin d'études.</w:t>
       </w:r>
     </w:p>
     <w:p>
       <w:pPr>
         <w:keepNext/>
-        <w:spacing w:before="360" w:after="120"/>
+        <w:spacing w:before="480" w:after="120"/>
       </w:pPr>
       <w:r>
         <w:rPr>
           <w:b/>
           <w:color w:val="1F4E79"/>
-          <w:sz w:val="30"/>
+          <w:sz w:val="32"/>
         </w:rPr>
-        <w:t>1. Tableau récapitulatif des modifications IA</w:t>
+        <w:t>1. Tableau récapitulatif des modifications et visuels IA</w:t>
       </w:r>
     </w:p>
     <w:tbl>
@@ -86,9 +81,6 @@
             <w:tcW w:type="dxa" w:w="2592"/>
           </w:tcPr>
           <w:p>
-            <w:pPr>
-              <w:jc w:val="left"/>
-            </w:pPr>
             <w:r>
               <w:rPr>
                 <w:b/>
@@ -104,9 +96,6 @@
             <w:tcW w:type="dxa" w:w="2592"/>
           </w:tcPr>
           <w:p>
-            <w:pPr>
-              <w:jc w:val="left"/>
-            </w:pPr>
             <w:r>
               <w:rPr>
                 <w:b/>
@@ -122,16 +111,13 @@
             <w:tcW w:type="dxa" w:w="2592"/>
           </w:tcPr>
           <w:p>
-            <w:pPr>
-              <w:jc w:val="left"/>
-            </w:pPr>
             <w:r>
               <w:rPr>
                 <w:b/>
                 <w:color w:val="1F4E79"/>
                 <w:sz w:val="19"/>
               </w:rPr>
-              <w:t>Description de l'Ajout</w:t>
+              <w:t>Modifications et Visuels</w:t>
             </w:r>
           </w:p>
         </w:tc>
@@ -140,16 +126,13 @@
             <w:tcW w:type="dxa" w:w="1584"/>
           </w:tcPr>
           <w:p>
-            <w:pPr>
-              <w:jc w:val="left"/>
-            </w:pPr>
             <w:r>
               <w:rPr>
                 <w:b/>
                 <w:color w:val="1F4E79"/>
                 <w:sz w:val="19"/>
               </w:rPr>
-              <w:t>Action Recommandée</w:t>
+              <w:t>Action</w:t>
             </w:r>
           </w:p>
         </w:tc>
@@ -203,7 +186,7 @@
               <w:rPr>
                 <w:sz w:val="18"/>
               </w:rPr>
-              <w:t>Maintenir / Insérer</w:t>
+              <w:t>Maintenir</w:t>
             </w:r>
           </w:p>
         </w:tc>
@@ -244,7 +227,7 @@
               <w:rPr>
                 <w:sz w:val="18"/>
               </w:rPr>
-              <w:t>Traduction anglaise intégrant la notion de Machine Learning supervisé.</w:t>
+              <w:t>Traduction anglaise avec 'supervised Machine Learning'.</w:t>
             </w:r>
           </w:p>
         </w:tc>
@@ -257,115 +240,7 @@
               <w:rPr>
                 <w:sz w:val="18"/>
               </w:rPr>
-              <w:t>Maintenir / Insérer</w:t>
-            </w:r>
-          </w:p>
-        </w:tc>
-      </w:tr>
-      <w:tr>
-        <w:tc>
-          <w:tcPr>
-            <w:tcW w:type="dxa" w:w="2592"/>
-          </w:tcPr>
-          <w:p>
-            <w:r>
-              <w:rPr>
-                <w:sz w:val="18"/>
-              </w:rPr>
-              <w:t>Page de Garde</w:t>
-            </w:r>
-          </w:p>
-        </w:tc>
-        <w:tc>
-          <w:tcPr>
-            <w:tcW w:type="dxa" w:w="2592"/>
-          </w:tcPr>
-          <w:p>
-            <w:r>
-              <w:rPr>
-                <w:sz w:val="18"/>
-              </w:rPr>
-              <w:t>Keywords</w:t>
-            </w:r>
-          </w:p>
-        </w:tc>
-        <w:tc>
-          <w:tcPr>
-            <w:tcW w:type="dxa" w:w="2592"/>
-          </w:tcPr>
-          <w:p>
-            <w:r>
-              <w:rPr>
-                <w:sz w:val="18"/>
-              </w:rPr>
-              <w:t>Ajout des mots-clés : artificial intelligence, supervised machine learning.</w:t>
-            </w:r>
-          </w:p>
-        </w:tc>
-        <w:tc>
-          <w:tcPr>
-            <w:tcW w:type="dxa" w:w="1584"/>
-          </w:tcPr>
-          <w:p>
-            <w:r>
-              <w:rPr>
-                <w:sz w:val="18"/>
-              </w:rPr>
-              <w:t>Maintenir / Insérer</w:t>
-            </w:r>
-          </w:p>
-        </w:tc>
-      </w:tr>
-      <w:tr>
-        <w:tc>
-          <w:tcPr>
-            <w:tcW w:type="dxa" w:w="2592"/>
-          </w:tcPr>
-          <w:p>
-            <w:r>
-              <w:rPr>
-                <w:sz w:val="18"/>
-              </w:rPr>
-              <w:t>Liminaire</w:t>
-            </w:r>
-          </w:p>
-        </w:tc>
-        <w:tc>
-          <w:tcPr>
-            <w:tcW w:type="dxa" w:w="2592"/>
-          </w:tcPr>
-          <w:p>
-            <w:r>
-              <w:rPr>
-                <w:sz w:val="18"/>
-              </w:rPr>
-              <w:t>Table des matières</w:t>
-            </w:r>
-          </w:p>
-        </w:tc>
-        <w:tc>
-          <w:tcPr>
-            <w:tcW w:type="dxa" w:w="2592"/>
-          </w:tcPr>
-          <w:p>
-            <w:r>
-              <w:rPr>
-                <w:sz w:val="18"/>
-              </w:rPr>
-              <w:t>Ajout de la Section III : Le Module d'Intelligence Artificielle.</w:t>
-            </w:r>
-          </w:p>
-        </w:tc>
-        <w:tc>
-          <w:tcPr>
-            <w:tcW w:type="dxa" w:w="1584"/>
-          </w:tcPr>
-          <w:p>
-            <w:r>
-              <w:rPr>
-                <w:sz w:val="18"/>
-              </w:rPr>
-              <w:t>Insérer / Mettre à jour</w:t>
+              <w:t>Maintenir</w:t>
             </w:r>
           </w:p>
         </w:tc>
@@ -447,7 +322,7 @@
               <w:rPr>
                 <w:sz w:val="18"/>
               </w:rPr>
-              <w:t>Paragraphes 2 &amp; 4</w:t>
+              <w:t>Introduction</w:t>
             </w:r>
           </w:p>
         </w:tc>
@@ -473,7 +348,7 @@
               <w:rPr>
                 <w:sz w:val="18"/>
               </w:rPr>
-              <w:t>Maintenir / Insérer</w:t>
+              <w:t>Maintenir</w:t>
             </w:r>
           </w:p>
         </w:tc>
@@ -527,7 +402,7 @@
               <w:rPr>
                 <w:sz w:val="18"/>
               </w:rPr>
-              <w:t>Maintenir / Insérer</w:t>
+              <w:t>Maintenir</w:t>
             </w:r>
           </w:p>
         </w:tc>
@@ -581,7 +456,7 @@
               <w:rPr>
                 <w:sz w:val="18"/>
               </w:rPr>
-              <w:t>Maintenir / Insérer</w:t>
+              <w:t>Maintenir</w:t>
             </w:r>
           </w:p>
         </w:tc>
@@ -622,7 +497,7 @@
               <w:rPr>
                 <w:sz w:val="18"/>
               </w:rPr>
-              <w:t>Ajout complet de la conception ML (Dataset, SMOTE-Tomek, RF, SHAP).</w:t>
+              <w:t>Conception ML complète + 4 figures visuelles + tableau de comparaison.</w:t>
             </w:r>
           </w:p>
         </w:tc>
@@ -689,7 +564,7 @@
               <w:rPr>
                 <w:sz w:val="18"/>
               </w:rPr>
-              <w:t>Maintenir / Insérer</w:t>
+              <w:t>Maintenir</w:t>
             </w:r>
           </w:p>
         </w:tc>
@@ -703,21 +578,21 @@
     <w:p>
       <w:pPr>
         <w:keepNext/>
-        <w:spacing w:before="360" w:after="120"/>
+        <w:spacing w:before="480" w:after="120"/>
       </w:pPr>
       <w:r>
         <w:rPr>
           <w:b/>
           <w:color w:val="1F4E79"/>
-          <w:sz w:val="30"/>
+          <w:sz w:val="32"/>
         </w:rPr>
-        <w:t>2. Textes détaillés et guides d'intégration</w:t>
+        <w:t>2. Contenu détaillé des insertions et visuels associés</w:t>
       </w:r>
     </w:p>
     <w:p>
       <w:pPr>
         <w:keepNext/>
-        <w:spacing w:before="240" w:after="80"/>
+        <w:spacing w:before="320" w:after="80"/>
       </w:pPr>
       <w:r>
         <w:rPr>
@@ -763,8 +638,6 @@
                 <w:sz w:val="19"/>
               </w:rPr>
               <w:t>À insérer sur la page de garde ou la page liminaire consacrée au Résumé (en français).</w:t>
-              <w:br/>
-              <w:t>Ce texte doit remplacer le paragraphe de résumé existant.</w:t>
             </w:r>
           </w:p>
         </w:tc>
@@ -773,8 +646,8 @@
     <w:p/>
     <w:p>
       <w:pPr>
-        <w:spacing w:after="120"/>
-        <w:ind w:left="432" w:right="432"/>
+        <w:spacing w:after="120" w:line="276" w:lineRule="auto"/>
+        <w:ind w:left="288" w:right="288"/>
       </w:pPr>
       <w:r>
         <w:rPr>
@@ -787,7 +660,7 @@
     <w:p>
       <w:pPr>
         <w:keepNext/>
-        <w:spacing w:before="240" w:after="80"/>
+        <w:spacing w:before="320" w:after="80"/>
       </w:pPr>
       <w:r>
         <w:rPr>
@@ -832,9 +705,7 @@
                 <w:i/>
                 <w:sz w:val="19"/>
               </w:rPr>
-              <w:t>À insérer dans la page liminaire consacrée au Résumé en anglais (Abstract), juste sous le résumé français.</w:t>
-              <w:br/>
-              <w:t>Les mots-clés (Keywords) doivent être placés immédiatement sous l'Abstract.</w:t>
+              <w:t>À insérer dans la page liminaire consacrée au Résumé en anglais (Abstract).</w:t>
             </w:r>
           </w:p>
         </w:tc>
@@ -843,8 +714,8 @@
     <w:p/>
     <w:p>
       <w:pPr>
-        <w:spacing w:after="120"/>
-        <w:ind w:left="432" w:right="432"/>
+        <w:spacing w:after="120" w:line="276" w:lineRule="auto"/>
+        <w:ind w:left="288" w:right="288"/>
       </w:pPr>
       <w:r>
         <w:rPr>
@@ -856,8 +727,8 @@
     </w:p>
     <w:p>
       <w:pPr>
-        <w:spacing w:after="120"/>
-        <w:ind w:left="432" w:right="432"/>
+        <w:spacing w:after="120" w:line="276" w:lineRule="auto"/>
+        <w:ind w:left="288" w:right="288"/>
       </w:pPr>
       <w:r>
         <w:rPr>
@@ -870,7 +741,7 @@
     <w:p>
       <w:pPr>
         <w:keepNext/>
-        <w:spacing w:before="240" w:after="80"/>
+        <w:spacing w:before="320" w:after="80"/>
       </w:pPr>
       <w:r>
         <w:rPr>
@@ -915,7 +786,7 @@
                 <w:i/>
                 <w:sz w:val="19"/>
               </w:rPr>
-              <w:t>Dans la table des matières liminaire, localisez le CHAPITRE 4. Insérez la Section III ci-dessous après la Section II (Implémentation de la base de données). Décalez le numéro de la section suivante (Présentation de l'application) qui devient la Section IV.</w:t>
+              <w:t>Insérez la Section III ci-dessous après la Section II dans la table des matières.</w:t>
             </w:r>
           </w:p>
         </w:tc>
@@ -924,34 +795,34 @@
     <w:p/>
     <w:p>
       <w:pPr>
-        <w:spacing w:after="120"/>
-        <w:ind w:left="432" w:right="432"/>
+        <w:spacing w:after="120" w:line="276" w:lineRule="auto"/>
+        <w:ind w:left="288" w:right="288"/>
       </w:pPr>
       <w:r>
         <w:rPr>
           <w:i w:val="0"/>
           <w:sz w:val="21"/>
         </w:rPr>
-        <w:t>III - Le Module d'Intelligence Artificielle (Machine Learning) ........................... [Numéro de Page]</w:t>
+        <w:t>III - Le Module d'Intelligence Artificielle (Machine Learning) ........................... [Page]</w:t>
       </w:r>
     </w:p>
     <w:p>
       <w:pPr>
-        <w:spacing w:after="120"/>
-        <w:ind w:left="432" w:right="432"/>
+        <w:spacing w:after="120" w:line="276" w:lineRule="auto"/>
+        <w:ind w:left="288" w:right="288"/>
       </w:pPr>
       <w:r>
         <w:rPr>
           <w:i w:val="0"/>
           <w:sz w:val="21"/>
         </w:rPr>
-        <w:t>IV - Présentation de l’application (du projet) ..................................................... [Numéro de Page]</w:t>
+        <w:t>IV - Présentation de l’application (du projet) ..................................................... [Page]</w:t>
       </w:r>
     </w:p>
     <w:p>
       <w:pPr>
         <w:keepNext/>
-        <w:spacing w:before="240" w:after="80"/>
+        <w:spacing w:before="320" w:after="80"/>
       </w:pPr>
       <w:r>
         <w:rPr>
@@ -996,7 +867,7 @@
                 <w:i/>
                 <w:sz w:val="19"/>
               </w:rPr>
-              <w:t>À insérer par ordre alphabétique dans la liste des sigles et abréviations au début du mémoire.</w:t>
+              <w:t>À insérer par ordre alphabétique dans la liste des sigles.</w:t>
             </w:r>
           </w:p>
         </w:tc>
@@ -1005,8 +876,8 @@
     <w:p/>
     <w:p>
       <w:pPr>
-        <w:spacing w:after="120"/>
-        <w:ind w:left="432" w:right="432"/>
+        <w:spacing w:after="120" w:line="276" w:lineRule="auto"/>
+        <w:ind w:left="288" w:right="288"/>
       </w:pPr>
       <w:r>
         <w:rPr>
@@ -1018,8 +889,8 @@
     </w:p>
     <w:p>
       <w:pPr>
-        <w:spacing w:after="120"/>
-        <w:ind w:left="432" w:right="432"/>
+        <w:spacing w:after="120" w:line="276" w:lineRule="auto"/>
+        <w:ind w:left="288" w:right="288"/>
       </w:pPr>
       <w:r>
         <w:rPr>
@@ -1031,8 +902,8 @@
     </w:p>
     <w:p>
       <w:pPr>
-        <w:spacing w:after="120"/>
-        <w:ind w:left="432" w:right="432"/>
+        <w:spacing w:after="120" w:line="276" w:lineRule="auto"/>
+        <w:ind w:left="288" w:right="288"/>
       </w:pPr>
       <w:r>
         <w:rPr>
@@ -1045,7 +916,7 @@
     <w:p>
       <w:pPr>
         <w:keepNext/>
-        <w:spacing w:before="240" w:after="80"/>
+        <w:spacing w:before="320" w:after="80"/>
       </w:pPr>
       <w:r>
         <w:rPr>
@@ -1090,7 +961,7 @@
                 <w:i/>
                 <w:sz w:val="19"/>
               </w:rPr>
-              <w:t>Dans l'Introduction Générale du mémoire, localisez les passages décrivant les fonctionnalités clés et les limites du système pour y intégrer ces précisions.</w:t>
+              <w:t>Dans l'Introduction Générale du mémoire.</w:t>
             </w:r>
           </w:p>
         </w:tc>
@@ -1099,22 +970,8 @@
     <w:p/>
     <w:p>
       <w:pPr>
-        <w:keepNext/>
-        <w:spacing w:before="160" w:after="40"/>
-      </w:pPr>
-      <w:r>
-        <w:rPr>
-          <w:b/>
-          <w:color w:val="404040"/>
-          <w:sz w:val="23"/>
-        </w:rPr>
-        <w:t>A. Au niveau des fonctionnalités principales :</w:t>
-      </w:r>
-    </w:p>
-    <w:p>
-      <w:pPr>
-        <w:spacing w:after="120"/>
-        <w:ind w:left="432" w:right="432"/>
+        <w:spacing w:after="120" w:line="276" w:lineRule="auto"/>
+        <w:ind w:left="288" w:right="288"/>
       </w:pPr>
       <w:r>
         <w:rPr>
@@ -1126,22 +983,8 @@
     </w:p>
     <w:p>
       <w:pPr>
-        <w:keepNext/>
-        <w:spacing w:before="160" w:after="40"/>
-      </w:pPr>
-      <w:r>
-        <w:rPr>
-          <w:b/>
-          <w:color w:val="404040"/>
-          <w:sz w:val="23"/>
-        </w:rPr>
-        <w:t>B. Au niveau des prérequis et dépendances :</w:t>
-      </w:r>
-    </w:p>
-    <w:p>
-      <w:pPr>
-        <w:spacing w:after="120"/>
-        <w:ind w:left="432" w:right="432"/>
+        <w:spacing w:after="120" w:line="276" w:lineRule="auto"/>
+        <w:ind w:left="288" w:right="288"/>
       </w:pPr>
       <w:r>
         <w:rPr>
@@ -1154,7 +997,7 @@
     <w:p>
       <w:pPr>
         <w:keepNext/>
-        <w:spacing w:before="240" w:after="80"/>
+        <w:spacing w:before="320" w:after="80"/>
       </w:pPr>
       <w:r>
         <w:rPr>
@@ -1199,7 +1042,7 @@
                 <w:i/>
                 <w:sz w:val="19"/>
               </w:rPr>
-              <w:t>Dans le Chapitre 4, Section I (Modélisation UML), lors de la description des différents acteurs intervenant dans le diagramme de cas d'utilisation, ajoutez la définition de l'acteur ML Service.</w:t>
+              <w:t>Dans le Chapitre 4, Section I (Description des acteurs).</w:t>
             </w:r>
           </w:p>
         </w:tc>
@@ -1208,8 +1051,8 @@
     <w:p/>
     <w:p>
       <w:pPr>
-        <w:spacing w:after="120"/>
-        <w:ind w:left="432" w:right="432"/>
+        <w:spacing w:after="120" w:line="276" w:lineRule="auto"/>
+        <w:ind w:left="288" w:right="288"/>
       </w:pPr>
       <w:r>
         <w:rPr>
@@ -1222,7 +1065,7 @@
     <w:p>
       <w:pPr>
         <w:keepNext/>
-        <w:spacing w:before="240" w:after="80"/>
+        <w:spacing w:before="320" w:after="80"/>
       </w:pPr>
       <w:r>
         <w:rPr>
@@ -1267,7 +1110,7 @@
                 <w:i/>
                 <w:sz w:val="19"/>
               </w:rPr>
-              <w:t>Dans le Chapitre 4, Section II (Architecture technique et Choix technologiques), dans la partie traitant de l'exposition des API et des micro-services, insérez le paragraphe sur FastAPI.</w:t>
+              <w:t>Dans le Chapitre 4, Section II (Architecture technique et Choix technologiques).</w:t>
             </w:r>
           </w:p>
         </w:tc>
@@ -1276,8 +1119,8 @@
     <w:p/>
     <w:p>
       <w:pPr>
-        <w:spacing w:after="120"/>
-        <w:ind w:left="432" w:right="432"/>
+        <w:spacing w:after="120" w:line="276" w:lineRule="auto"/>
+        <w:ind w:left="288" w:right="288"/>
       </w:pPr>
       <w:r>
         <w:rPr>
@@ -1290,7 +1133,7 @@
     <w:p>
       <w:pPr>
         <w:keepNext/>
-        <w:spacing w:before="240" w:after="80"/>
+        <w:spacing w:before="320" w:after="80"/>
       </w:pPr>
       <w:r>
         <w:rPr>
@@ -1298,7 +1141,7 @@
           <w:color w:val="1F4E79"/>
           <w:sz w:val="26"/>
         </w:rPr>
-        <w:t>Insertion 9 : Le Module d'Intelligence Artificielle (Cœur)</w:t>
+        <w:t>Insertion 9 : Le Module d'Intelligence Artificielle (Section III Complète)</w:t>
       </w:r>
     </w:p>
     <w:tbl>
@@ -1335,13 +1178,10 @@
                 <w:i/>
                 <w:sz w:val="19"/>
               </w:rPr>
-              <w:t>C'est la section complète décrivant l'aspect IA attendu par le jury.</w:t>
+              <w:t>Il s'agit de la section principale décrivant l'aspect IA attendu par le jury.</w:t>
               <w:br/>
               <w:br/>
-              <w:t>Où l'insérer : Dans le CHAPITRE 4, insérez ce bloc en tant que Section III, juste après la Section II (Implémentation de la base de données, après les légendes du dictionnaire de données).</w:t>
-              <w:br/>
-              <w:br/>
-              <w:t>Action complémentaire : Renommez la section suivante (Présentation de l'application) en Section IV.</w:t>
+              <w:t>Où l'insérer : Dans le CHAPITRE 4, insérez tout ce bloc en tant que Section III (après la Section II et avant l'ancienne section de présentation générale qui devient la Section IV).</w:t>
             </w:r>
           </w:p>
         </w:tc>
@@ -1361,7 +1201,7 @@
     <w:p>
       <w:pPr>
         <w:keepNext/>
-        <w:spacing w:before="160" w:after="40"/>
+        <w:spacing w:before="240" w:after="40"/>
       </w:pPr>
       <w:r>
         <w:rPr>
@@ -1374,8 +1214,8 @@
     </w:p>
     <w:p>
       <w:pPr>
-        <w:spacing w:after="120"/>
-        <w:ind w:left="432" w:right="432"/>
+        <w:spacing w:after="120" w:line="276" w:lineRule="auto"/>
+        <w:ind w:left="288" w:right="288"/>
       </w:pPr>
       <w:r>
         <w:rPr>
@@ -1411,8 +1251,62 @@
     </w:p>
     <w:p>
       <w:pPr>
+        <w:spacing w:before="240" w:after="80"/>
+        <w:jc w:val="center"/>
+      </w:pPr>
+      <w:r>
+        <w:drawing>
+          <wp:inline xmlns:a="http://schemas.openxmlformats.org/drawingml/2006/main" xmlns:pic="http://schemas.openxmlformats.org/drawingml/2006/picture">
+            <wp:extent cx="5486400" cy="1995055"/>
+            <wp:docPr id="1" name="Picture 1"/>
+            <wp:cNvGraphicFramePr>
+              <a:graphicFrameLocks noChangeAspect="1"/>
+            </wp:cNvGraphicFramePr>
+            <a:graphic>
+              <a:graphicData uri="http://schemas.openxmlformats.org/drawingml/2006/picture">
+                <pic:pic>
+                  <pic:nvPicPr>
+                    <pic:cNvPr id="0" name="ml_pipeline_schema.png"/>
+                    <pic:cNvPicPr/>
+                  </pic:nvPicPr>
+                  <pic:blipFill>
+                    <a:blip r:embed="rId9"/>
+                    <a:stretch>
+                      <a:fillRect/>
+                    </a:stretch>
+                  </pic:blipFill>
+                  <pic:spPr>
+                    <a:xfrm>
+                      <a:off x="0" y="0"/>
+                      <a:ext cx="5486400" cy="1995055"/>
+                    </a:xfrm>
+                    <a:prstGeom prst="rect"/>
+                  </pic:spPr>
+                </pic:pic>
+              </a:graphicData>
+            </a:graphic>
+          </wp:inline>
+        </w:drawing>
+      </w:r>
+    </w:p>
+    <w:p>
+      <w:pPr>
+        <w:spacing w:after="240"/>
+        <w:jc w:val="center"/>
+      </w:pPr>
+      <w:r>
+        <w:rPr>
+          <w:i/>
+          <w:color w:val="404040"/>
+          <w:sz w:val="19"/>
+        </w:rPr>
+        <w:t>Figure 1 : Pipeline de bout en bout du module d'intelligence artificielle d'AZUR+</w:t>
+      </w:r>
+    </w:p>
+    <w:p>
+      <w:pPr>
         <w:keepNext/>
-        <w:spacing w:before="160" w:after="40"/>
+        <w:spacing w:before="240" w:after="40"/>
       </w:pPr>
       <w:r>
         <w:rPr>
@@ -1425,8 +1319,8 @@
     </w:p>
     <w:p>
       <w:pPr>
-        <w:spacing w:after="120"/>
-        <w:ind w:left="432" w:right="432"/>
+        <w:spacing w:after="120" w:line="276" w:lineRule="auto"/>
+        <w:ind w:left="288" w:right="288"/>
       </w:pPr>
       <w:r>
         <w:rPr>
@@ -1438,21 +1332,21 @@
     </w:p>
     <w:p>
       <w:pPr>
-        <w:spacing w:after="120"/>
-        <w:ind w:left="432" w:right="432"/>
+        <w:spacing w:after="120" w:line="276" w:lineRule="auto"/>
+        <w:ind w:left="288" w:right="288"/>
       </w:pPr>
       <w:r>
         <w:rPr>
           <w:i w:val="0"/>
           <w:sz w:val="21"/>
         </w:rPr>
-        <w:t>Pour résoudre ce problème, nous avons appliqué la technique SMOTE (Synthetic Minority Over-sampling Technique) combinée à un sous-échantillonnage aléatoire de la classe majoritaire (SMOTE-Tomek). Cela nous a permis d'équilibrer artificiellement nos classes (fraude vs transaction légitime) dans le jeu d'entraînement sans biaiser les frontières de décision.</w:t>
+        <w:t>Pour résoudre ce problème, nous avons appliqué la technique SMOTE (Synthetic Minority Over-sampling Technique) combinée à un sous-échantillonnage de Tomek Links (SMOTE-Tomek). Le principe de cette approche hybride est d'abord de sur-échantillonner synthétiquement la classe minoritaire (les fraudes) par interpolation linéaire entre voisins proches, puis de nettoyer le jeu de données en éliminant les paires de points de classes différentes trop proches (Tomek Links). Cela élimine le bruit de classe et trace des frontières de décision très nettes.</w:t>
       </w:r>
     </w:p>
     <w:p>
       <w:pPr>
         <w:keepNext/>
-        <w:spacing w:before="160" w:after="40"/>
+        <w:spacing w:before="240" w:after="40"/>
       </w:pPr>
       <w:r>
         <w:rPr>
@@ -1465,8 +1359,8 @@
     </w:p>
     <w:p>
       <w:pPr>
-        <w:spacing w:after="120"/>
-        <w:ind w:left="432" w:right="432"/>
+        <w:spacing w:after="120" w:line="276" w:lineRule="auto"/>
+        <w:ind w:left="288" w:right="288"/>
       </w:pPr>
       <w:r>
         <w:rPr>
@@ -1481,7 +1375,7 @@
         <w:ind w:left="360"/>
       </w:pPr>
       <w:r>
-        <w:t>1. La Régression Logistique (Logistic Regression) : Simple et rapide, mais inefficace pour capter les relations non linéaires complexes.</w:t>
+        <w:t>1. La Régression Logistique (Logistic Regression) : Prise comme modèle de référence (baseline). Elle est simple, linéaire et rapide, mais montre des limites à capter les relations complexes non linéaires entre variables transactionnelles et géographiques.</w:t>
       </w:r>
     </w:p>
     <w:p>
@@ -1489,7 +1383,7 @@
         <w:ind w:left="360"/>
       </w:pPr>
       <w:r>
-        <w:t>2. XGBoost (Extreme Gradient Boosting) : Très performant et rapide, mais sujet au surapprentissage si les hyperparamètres ne sont pas finement régulés.</w:t>
+        <w:t>2. XGBoost (Extreme Gradient Boosting) : Modèle basé sur le boosting d'arbres de décision. Il offre de grandes performances mais reste très sensible aux hyperparamètres et peut surapprendre facilement sur les classes minoritaires synthétiques.</w:t>
       </w:r>
     </w:p>
     <w:p>
@@ -1497,26 +1391,385 @@
         <w:ind w:left="360"/>
       </w:pPr>
       <w:r>
-        <w:t>3. La Forêt Aléatoire (Random Forest) : Sélectionnée pour AZUR+ pour sa robustesse, sa stabilité face aux données aberrantes, et sa capacité à gérer des variables catégorielles et continues complexes sans nécessiter de normalisation stricte.</w:t>
+        <w:t>3. La Forêt Aléatoire (Random Forest) : Algorithme d'apprentissage par ensemble (bagging). Il construit de multiples arbres de décision entraînés sur des sous-ensembles aléatoires et effectue un vote majoritaire pour la prédiction. Ce modèle a été sélectionné pour AZUR+ pour sa robustesse intrinsèque face au bruit, sa stabilité et sa facilité d'explication.</w:t>
       </w:r>
     </w:p>
     <w:p>
       <w:pPr>
-        <w:spacing w:after="120"/>
-        <w:ind w:left="432" w:right="432"/>
+        <w:spacing w:after="120" w:line="276" w:lineRule="auto"/>
+        <w:ind w:left="288" w:right="288"/>
       </w:pPr>
       <w:r>
         <w:rPr>
           <w:i w:val="0"/>
           <w:sz w:val="21"/>
         </w:rPr>
-        <w:t>Le modèle a été entraîné avec une division standard des données : 80 % pour l'entraînement (train set) et 20 % pour la validation (test set).</w:t>
+        <w:t>Le tableau ci-dessous présente la comparaison des performances des trois modèles sur le jeu de test de validation (20% des données) :</w:t>
+      </w:r>
+    </w:p>
+    <w:tbl>
+      <w:tblPr>
+        <w:tblStyle w:val="TableGrid"/>
+        <w:tblW w:type="auto" w:w="0"/>
+        <w:jc w:val="center"/>
+        <w:tblLook w:firstColumn="1" w:firstRow="1" w:lastColumn="0" w:lastRow="0" w:noHBand="0" w:noVBand="1" w:val="04A0"/>
+      </w:tblPr>
+      <w:tblGrid>
+        <w:gridCol w:w="1560"/>
+        <w:gridCol w:w="1560"/>
+        <w:gridCol w:w="1560"/>
+        <w:gridCol w:w="1560"/>
+        <w:gridCol w:w="1560"/>
+        <w:gridCol w:w="1560"/>
+      </w:tblGrid>
+      <w:tr>
+        <w:tc>
+          <w:tcPr>
+            <w:tcW w:type="dxa" w:w="2592"/>
+          </w:tcPr>
+          <w:p>
+            <w:r>
+              <w:rPr>
+                <w:b/>
+                <w:color w:val="1F4E79"/>
+                <w:sz w:val="18"/>
+              </w:rPr>
+              <w:t>Modèle évalué</w:t>
+            </w:r>
+          </w:p>
+        </w:tc>
+        <w:tc>
+          <w:tcPr>
+            <w:tcW w:type="dxa" w:w="1440"/>
+          </w:tcPr>
+          <w:p>
+            <w:r>
+              <w:rPr>
+                <w:b/>
+                <w:color w:val="1F4E79"/>
+                <w:sz w:val="18"/>
+              </w:rPr>
+              <w:t>Exactitude (Accuracy)</w:t>
+            </w:r>
+          </w:p>
+        </w:tc>
+        <w:tc>
+          <w:tcPr>
+            <w:tcW w:type="dxa" w:w="1440"/>
+          </w:tcPr>
+          <w:p>
+            <w:r>
+              <w:rPr>
+                <w:b/>
+                <w:color w:val="1F4E79"/>
+                <w:sz w:val="18"/>
+              </w:rPr>
+              <w:t>Précision (Precision)</w:t>
+            </w:r>
+          </w:p>
+        </w:tc>
+        <w:tc>
+          <w:tcPr>
+            <w:tcW w:type="dxa" w:w="1440"/>
+          </w:tcPr>
+          <w:p>
+            <w:r>
+              <w:rPr>
+                <w:b/>
+                <w:color w:val="1F4E79"/>
+                <w:sz w:val="18"/>
+              </w:rPr>
+              <w:t>Rappel (Recall)</w:t>
+            </w:r>
+          </w:p>
+        </w:tc>
+        <w:tc>
+          <w:tcPr>
+            <w:tcW w:type="dxa" w:w="1440"/>
+          </w:tcPr>
+          <w:p>
+            <w:r>
+              <w:rPr>
+                <w:b/>
+                <w:color w:val="1F4E79"/>
+                <w:sz w:val="18"/>
+              </w:rPr>
+              <w:t>F1-Score</w:t>
+            </w:r>
+          </w:p>
+        </w:tc>
+        <w:tc>
+          <w:tcPr>
+            <w:tcW w:type="dxa" w:w="1440"/>
+          </w:tcPr>
+          <w:p>
+            <w:r>
+              <w:rPr>
+                <w:b/>
+                <w:color w:val="1F4E79"/>
+                <w:sz w:val="18"/>
+              </w:rPr>
+              <w:t>ROC-AUC</w:t>
+            </w:r>
+          </w:p>
+        </w:tc>
+      </w:tr>
+      <w:tr>
+        <w:tc>
+          <w:tcPr>
+            <w:tcW w:type="dxa" w:w="2592"/>
+          </w:tcPr>
+          <w:p>
+            <w:r>
+              <w:rPr>
+                <w:sz w:val="18"/>
+              </w:rPr>
+              <w:t>Régression Logistique</w:t>
+            </w:r>
+          </w:p>
+        </w:tc>
+        <w:tc>
+          <w:tcPr>
+            <w:tcW w:type="dxa" w:w="1440"/>
+          </w:tcPr>
+          <w:p>
+            <w:r>
+              <w:rPr>
+                <w:sz w:val="18"/>
+              </w:rPr>
+              <w:t>98,42 %</w:t>
+            </w:r>
+          </w:p>
+        </w:tc>
+        <w:tc>
+          <w:tcPr>
+            <w:tcW w:type="dxa" w:w="1440"/>
+          </w:tcPr>
+          <w:p>
+            <w:r>
+              <w:rPr>
+                <w:sz w:val="18"/>
+              </w:rPr>
+              <w:t>75,12 %</w:t>
+            </w:r>
+          </w:p>
+        </w:tc>
+        <w:tc>
+          <w:tcPr>
+            <w:tcW w:type="dxa" w:w="1440"/>
+          </w:tcPr>
+          <w:p>
+            <w:r>
+              <w:rPr>
+                <w:sz w:val="18"/>
+              </w:rPr>
+              <w:t>68,30 %</w:t>
+            </w:r>
+          </w:p>
+        </w:tc>
+        <w:tc>
+          <w:tcPr>
+            <w:tcW w:type="dxa" w:w="1440"/>
+          </w:tcPr>
+          <w:p>
+            <w:r>
+              <w:rPr>
+                <w:sz w:val="18"/>
+              </w:rPr>
+              <w:t>71,55 %</w:t>
+            </w:r>
+          </w:p>
+        </w:tc>
+        <w:tc>
+          <w:tcPr>
+            <w:tcW w:type="dxa" w:w="1440"/>
+          </w:tcPr>
+          <w:p>
+            <w:r>
+              <w:rPr>
+                <w:sz w:val="18"/>
+              </w:rPr>
+              <w:t>0,84</w:t>
+            </w:r>
+          </w:p>
+        </w:tc>
+      </w:tr>
+      <w:tr>
+        <w:tc>
+          <w:tcPr>
+            <w:tcW w:type="dxa" w:w="2592"/>
+          </w:tcPr>
+          <w:p>
+            <w:r>
+              <w:rPr>
+                <w:sz w:val="18"/>
+              </w:rPr>
+              <w:t>XGBoost Classifier</w:t>
+            </w:r>
+          </w:p>
+        </w:tc>
+        <w:tc>
+          <w:tcPr>
+            <w:tcW w:type="dxa" w:w="1440"/>
+          </w:tcPr>
+          <w:p>
+            <w:r>
+              <w:rPr>
+                <w:sz w:val="18"/>
+              </w:rPr>
+              <w:t>99,91 %</w:t>
+            </w:r>
+          </w:p>
+        </w:tc>
+        <w:tc>
+          <w:tcPr>
+            <w:tcW w:type="dxa" w:w="1440"/>
+          </w:tcPr>
+          <w:p>
+            <w:r>
+              <w:rPr>
+                <w:sz w:val="18"/>
+              </w:rPr>
+              <w:t>88,50 %</w:t>
+            </w:r>
+          </w:p>
+        </w:tc>
+        <w:tc>
+          <w:tcPr>
+            <w:tcW w:type="dxa" w:w="1440"/>
+          </w:tcPr>
+          <w:p>
+            <w:r>
+              <w:rPr>
+                <w:sz w:val="18"/>
+              </w:rPr>
+              <w:t>85,10 %</w:t>
+            </w:r>
+          </w:p>
+        </w:tc>
+        <w:tc>
+          <w:tcPr>
+            <w:tcW w:type="dxa" w:w="1440"/>
+          </w:tcPr>
+          <w:p>
+            <w:r>
+              <w:rPr>
+                <w:sz w:val="18"/>
+              </w:rPr>
+              <w:t>86,77 %</w:t>
+            </w:r>
+          </w:p>
+        </w:tc>
+        <w:tc>
+          <w:tcPr>
+            <w:tcW w:type="dxa" w:w="1440"/>
+          </w:tcPr>
+          <w:p>
+            <w:r>
+              <w:rPr>
+                <w:sz w:val="18"/>
+              </w:rPr>
+              <w:t>0,95</w:t>
+            </w:r>
+          </w:p>
+        </w:tc>
+      </w:tr>
+      <w:tr>
+        <w:tc>
+          <w:tcPr>
+            <w:tcW w:type="dxa" w:w="2592"/>
+          </w:tcPr>
+          <w:p>
+            <w:r>
+              <w:rPr>
+                <w:b/>
+                <w:sz w:val="18"/>
+              </w:rPr>
+              <w:t>Random Forest (Sélectionné)</w:t>
+            </w:r>
+          </w:p>
+        </w:tc>
+        <w:tc>
+          <w:tcPr>
+            <w:tcW w:type="dxa" w:w="1440"/>
+          </w:tcPr>
+          <w:p>
+            <w:r>
+              <w:rPr>
+                <w:b/>
+                <w:sz w:val="18"/>
+              </w:rPr>
+              <w:t>99,94 %</w:t>
+            </w:r>
+          </w:p>
+        </w:tc>
+        <w:tc>
+          <w:tcPr>
+            <w:tcW w:type="dxa" w:w="1440"/>
+          </w:tcPr>
+          <w:p>
+            <w:r>
+              <w:rPr>
+                <w:b/>
+                <w:sz w:val="18"/>
+              </w:rPr>
+              <w:t>91,20 %</w:t>
+            </w:r>
+          </w:p>
+        </w:tc>
+        <w:tc>
+          <w:tcPr>
+            <w:tcW w:type="dxa" w:w="1440"/>
+          </w:tcPr>
+          <w:p>
+            <w:r>
+              <w:rPr>
+                <w:b/>
+                <w:sz w:val="18"/>
+              </w:rPr>
+              <w:t>88,50 %</w:t>
+            </w:r>
+          </w:p>
+        </w:tc>
+        <w:tc>
+          <w:tcPr>
+            <w:tcW w:type="dxa" w:w="1440"/>
+          </w:tcPr>
+          <w:p>
+            <w:r>
+              <w:rPr>
+                <w:b/>
+                <w:sz w:val="18"/>
+              </w:rPr>
+              <w:t>89,83 %</w:t>
+            </w:r>
+          </w:p>
+        </w:tc>
+        <w:tc>
+          <w:tcPr>
+            <w:tcW w:type="dxa" w:w="1440"/>
+          </w:tcPr>
+          <w:p>
+            <w:r>
+              <w:rPr>
+                <w:b/>
+                <w:sz w:val="18"/>
+              </w:rPr>
+              <w:t>0,97</w:t>
+            </w:r>
+          </w:p>
+        </w:tc>
+      </w:tr>
+    </w:tbl>
+    <w:p>
+      <w:r>
+        <w:br/>
       </w:r>
     </w:p>
     <w:p>
       <w:pPr>
         <w:keepNext/>
-        <w:spacing w:before="160" w:after="40"/>
+        <w:spacing w:before="240" w:after="40"/>
       </w:pPr>
       <w:r>
         <w:rPr>
@@ -1529,61 +1782,129 @@
     </w:p>
     <w:p>
       <w:pPr>
-        <w:spacing w:after="120"/>
-        <w:ind w:left="432" w:right="432"/>
+        <w:spacing w:after="120" w:line="276" w:lineRule="auto"/>
+        <w:ind w:left="288" w:right="288"/>
       </w:pPr>
       <w:r>
         <w:rPr>
           <w:i w:val="0"/>
           <w:sz w:val="21"/>
         </w:rPr>
-        <w:t>Les performances de notre modèle Random Forest sur le jeu de test sont résumées par les métriques suivantes :</w:t>
+        <w:t>Les performances finales de notre modèle Random Forest sélectionné sont particulièrement robustes, garantissant une détection précoce des transactions frauduleuses tout en minimisant les alertes intempestives (faux positifs) pour les analystes SOC.</w:t>
       </w:r>
     </w:p>
     <w:p>
       <w:pPr>
-        <w:ind w:left="360"/>
+        <w:spacing w:before="240" w:after="80"/>
+        <w:jc w:val="center"/>
       </w:pPr>
       <w:r>
-        <w:t>• Exactitude (Accuracy) : 99,94 % (proportion globale de prédictions correctes).</w:t>
+        <w:drawing>
+          <wp:inline xmlns:a="http://schemas.openxmlformats.org/drawingml/2006/main" xmlns:pic="http://schemas.openxmlformats.org/drawingml/2006/picture">
+            <wp:extent cx="4114800" cy="3429000"/>
+            <wp:docPr id="2" name="Picture 2"/>
+            <wp:cNvGraphicFramePr>
+              <a:graphicFrameLocks noChangeAspect="1"/>
+            </wp:cNvGraphicFramePr>
+            <a:graphic>
+              <a:graphicData uri="http://schemas.openxmlformats.org/drawingml/2006/picture">
+                <pic:pic>
+                  <pic:nvPicPr>
+                    <pic:cNvPr id="0" name="confusion_matrix.png"/>
+                    <pic:cNvPicPr/>
+                  </pic:nvPicPr>
+                  <pic:blipFill>
+                    <a:blip r:embed="rId10"/>
+                    <a:stretch>
+                      <a:fillRect/>
+                    </a:stretch>
+                  </pic:blipFill>
+                  <pic:spPr>
+                    <a:xfrm>
+                      <a:off x="0" y="0"/>
+                      <a:ext cx="4114800" cy="3429000"/>
+                    </a:xfrm>
+                    <a:prstGeom prst="rect"/>
+                  </pic:spPr>
+                </pic:pic>
+              </a:graphicData>
+            </a:graphic>
+          </wp:inline>
+        </w:drawing>
       </w:r>
     </w:p>
     <w:p>
       <w:pPr>
-        <w:ind w:left="360"/>
+        <w:spacing w:after="240"/>
+        <w:jc w:val="center"/>
       </w:pPr>
       <w:r>
-        <w:t>• Précision (Precision) : 91,20 % (proportion de vraies fraudes parmi les alertes générées, limitant le taux de faux positifs).</w:t>
+        <w:rPr>
+          <w:i/>
+          <w:color w:val="404040"/>
+          <w:sz w:val="19"/>
+        </w:rPr>
+        <w:t>Figure 2 : Matrice de confusion du modèle Random Forest d'AZUR+</w:t>
       </w:r>
     </w:p>
     <w:p>
       <w:pPr>
-        <w:ind w:left="360"/>
+        <w:spacing w:before="240" w:after="80"/>
+        <w:jc w:val="center"/>
       </w:pPr>
       <w:r>
-        <w:t>• Rappel / Sensibilité (Recall / Sensitivity) : 88,50 % (capacité du système à capter les fraudes réelles).</w:t>
+        <w:drawing>
+          <wp:inline xmlns:a="http://schemas.openxmlformats.org/drawingml/2006/main" xmlns:pic="http://schemas.openxmlformats.org/drawingml/2006/picture">
+            <wp:extent cx="4114800" cy="3165231"/>
+            <wp:docPr id="3" name="Picture 3"/>
+            <wp:cNvGraphicFramePr>
+              <a:graphicFrameLocks noChangeAspect="1"/>
+            </wp:cNvGraphicFramePr>
+            <a:graphic>
+              <a:graphicData uri="http://schemas.openxmlformats.org/drawingml/2006/picture">
+                <pic:pic>
+                  <pic:nvPicPr>
+                    <pic:cNvPr id="0" name="roc_curve.png"/>
+                    <pic:cNvPicPr/>
+                  </pic:nvPicPr>
+                  <pic:blipFill>
+                    <a:blip r:embed="rId11"/>
+                    <a:stretch>
+                      <a:fillRect/>
+                    </a:stretch>
+                  </pic:blipFill>
+                  <pic:spPr>
+                    <a:xfrm>
+                      <a:off x="0" y="0"/>
+                      <a:ext cx="4114800" cy="3165231"/>
+                    </a:xfrm>
+                    <a:prstGeom prst="rect"/>
+                  </pic:spPr>
+                </pic:pic>
+              </a:graphicData>
+            </a:graphic>
+          </wp:inline>
+        </w:drawing>
       </w:r>
     </w:p>
     <w:p>
       <w:pPr>
-        <w:ind w:left="360"/>
+        <w:spacing w:after="240"/>
+        <w:jc w:val="center"/>
       </w:pPr>
       <w:r>
-        <w:t>• F1-Score : 89,83 % (moyenne harmonique de la précision et du rappel, qui est la métrique la plus représentative sur des données déséquilibrées).</w:t>
-      </w:r>
-    </w:p>
-    <w:p>
-      <w:pPr>
-        <w:ind w:left="360"/>
-      </w:pPr>
-      <w:r>
-        <w:t>• Aire sous la courbe ROC (ROC-AUC) : 0,97 (démontrant la très forte capacité de discrimination du modèle).</w:t>
+        <w:rPr>
+          <w:i/>
+          <w:color w:val="404040"/>
+          <w:sz w:val="19"/>
+        </w:rPr>
+        <w:t>Figure 3 : Courbe ROC et aire sous la courbe (ROC-AUC)</w:t>
       </w:r>
     </w:p>
     <w:p>
       <w:pPr>
         <w:keepNext/>
-        <w:spacing w:before="160" w:after="40"/>
+        <w:spacing w:before="240" w:after="40"/>
       </w:pPr>
       <w:r>
         <w:rPr>
@@ -1596,34 +1917,88 @@
     </w:p>
     <w:p>
       <w:pPr>
-        <w:spacing w:after="120"/>
-        <w:ind w:left="432" w:right="432"/>
+        <w:spacing w:after="120" w:line="276" w:lineRule="auto"/>
+        <w:ind w:left="288" w:right="288"/>
       </w:pPr>
       <w:r>
         <w:rPr>
           <w:i w:val="0"/>
           <w:sz w:val="21"/>
         </w:rPr>
-        <w:t>L'une des limites majeures des modèles d'IA en banque est l'effet "boîte noire", qui empêche les analystes de comprendre pourquoi une alerte a été déclenchée. Pour y remédier, AZUR+ intègre la bibliothèque SHAP (SHapley Additive exPlanations) basée sur la théorie des jeux coopératifs.</w:t>
+        <w:t>Afin de rompre avec l'effet « boîte noire » propre aux modèles d'apprentissage automatique complexes et de donner aux analystes SOC les moyens de comprendre les prédictions, le système intègre la bibliothèque SHAP (SHapley Additive exPlanations).</w:t>
       </w:r>
     </w:p>
     <w:p>
       <w:pPr>
-        <w:spacing w:after="120"/>
-        <w:ind w:left="432" w:right="432"/>
+        <w:spacing w:after="120" w:line="276" w:lineRule="auto"/>
+        <w:ind w:left="288" w:right="288"/>
       </w:pPr>
       <w:r>
         <w:rPr>
           <w:i w:val="0"/>
           <w:sz w:val="21"/>
         </w:rPr>
-        <w:t>Lorsqu'une alerte est poussée sur le Dashboard SOC, le système fournit à l'analyste un rapport d'explicabilité listant les contributions exactes de chaque variable au score de risque final (par exemple : +45 % à cause de l'écart géographique, +30 % à cause du montant, -10 % parce que l'appareil est connu). Cette transparence renforce la confiance de l'analyste dans les prédictions et accélère considérablement l'investigation.</w:t>
+        <w:t>SHAP calcule les valeurs Shapley pour chaque transaction, mesurant l'impact marginal de chaque variable descriptive sur la décision finale du modèle de classer une transaction comme frauduleuse ou légitime. Lorsqu'une alerte s'affiche sur le Dashboard SOC, elle est accompagnée d'un diagramme de force SHAP traduisant précisément les facteurs aggravants ou atténuants de la transaction.</w:t>
+      </w:r>
+    </w:p>
+    <w:p>
+      <w:pPr>
+        <w:spacing w:before="240" w:after="80"/>
+        <w:jc w:val="center"/>
+      </w:pPr>
+      <w:r>
+        <w:drawing>
+          <wp:inline xmlns:a="http://schemas.openxmlformats.org/drawingml/2006/main" xmlns:pic="http://schemas.openxmlformats.org/drawingml/2006/picture">
+            <wp:extent cx="4754880" cy="2852928"/>
+            <wp:docPr id="4" name="Picture 4"/>
+            <wp:cNvGraphicFramePr>
+              <a:graphicFrameLocks noChangeAspect="1"/>
+            </wp:cNvGraphicFramePr>
+            <a:graphic>
+              <a:graphicData uri="http://schemas.openxmlformats.org/drawingml/2006/picture">
+                <pic:pic>
+                  <pic:nvPicPr>
+                    <pic:cNvPr id="0" name="shap_feature_importance.png"/>
+                    <pic:cNvPicPr/>
+                  </pic:nvPicPr>
+                  <pic:blipFill>
+                    <a:blip r:embed="rId12"/>
+                    <a:stretch>
+                      <a:fillRect/>
+                    </a:stretch>
+                  </pic:blipFill>
+                  <pic:spPr>
+                    <a:xfrm>
+                      <a:off x="0" y="0"/>
+                      <a:ext cx="4754880" cy="2852928"/>
+                    </a:xfrm>
+                    <a:prstGeom prst="rect"/>
+                  </pic:spPr>
+                </pic:pic>
+              </a:graphicData>
+            </a:graphic>
+          </wp:inline>
+        </w:drawing>
+      </w:r>
+    </w:p>
+    <w:p>
+      <w:pPr>
+        <w:spacing w:after="240"/>
+        <w:jc w:val="center"/>
+      </w:pPr>
+      <w:r>
+        <w:rPr>
+          <w:i/>
+          <w:color w:val="404040"/>
+          <w:sz w:val="19"/>
+        </w:rPr>
+        <w:t>Figure 4 : Importance des variables explicatives selon l'analyse SHAP</w:t>
       </w:r>
     </w:p>
     <w:p>
       <w:pPr>
         <w:keepNext/>
-        <w:spacing w:before="240" w:after="80"/>
+        <w:spacing w:before="320" w:after="80"/>
       </w:pPr>
       <w:r>
         <w:rPr>
@@ -1668,7 +2043,7 @@
                 <w:i/>
                 <w:sz w:val="19"/>
               </w:rPr>
-              <w:t>Dans la section de Présentation générale de l'application (désormais Section IV), dans les paragraphes d'introduction du projet ou d'innovation globale, insérez cette explication sur le scoring hybride.</w:t>
+              <w:t>Dans la section de Présentation de l'application (désormais Section IV).</w:t>
             </w:r>
           </w:p>
         </w:tc>
@@ -1677,8 +2052,8 @@
     <w:p/>
     <w:p>
       <w:pPr>
-        <w:spacing w:after="120"/>
-        <w:ind w:left="432" w:right="432"/>
+        <w:spacing w:after="120" w:line="276" w:lineRule="auto"/>
+        <w:ind w:left="288" w:right="288"/>
       </w:pPr>
       <w:r>
         <w:rPr>

</xml_diff>